<commit_message>
Update handoff report: S2 7→8, S3 5→6, S8 3→5, total 54→58
- S2 (Data Model): transaction redesign, recipients lookup, redundant columns removed
- S3 (Config): BUG-1 resolved (job_scales key fix), bucket_key/job_key dropped
- S8 (Tech Debt): BUG-1 fixed, DEBT-3 resolved (providers dropped), invoice transitions added
- BUG-1 marked FIXED in Section 8 table

Co-Authored-By: Claude Sonnet 4.6 <noreply@anthropic.com>
</commit_message>
<xml_diff>
--- a/docs/ARCAD_Developer_Handoff_Report.docx
+++ b/docs/ARCAD_Developer_Handoff_Report.docx
@@ -173,7 +173,7 @@
                 <w:sz w:val="48"/>
                 <w:szCs w:val="48"/>
               </w:rPr>
-              <w:t>54 / 100</w:t>
+              <w:t>58 / 100</w:t>
             </w:r>
           </w:p>
         </w:tc>
@@ -1330,7 +1330,7 @@
           <w:sz w:val="26"/>
           <w:szCs w:val="26"/>
         </w:rPr>
-        <w:t xml:space="preserve">    7/10</w:t>
+        <w:t xml:space="preserve">    8/10</w:t>
       </w:r>
     </w:p>
     <w:p>
@@ -2368,7 +2368,7 @@
             </w:r>
             <w:proofErr w:type="spellStart"/>
             <w:r>
-              <w:t>schema_bb.providers</w:t>
+              <w:t>RESOLVED (2026-03-29) — schema_bb.providers table dropped. BB sites now use active_provider (varchar) column instead.</w:t>
             </w:r>
             <w:proofErr w:type="spellEnd"/>
             <w:r>
@@ -2506,7 +2506,7 @@
                 <w:sz w:val="32"/>
                 <w:szCs w:val="32"/>
               </w:rPr>
-              <w:t>7/10</w:t>
+              <w:t>8/10</w:t>
             </w:r>
           </w:p>
         </w:tc>
@@ -2529,7 +2529,7 @@
           </w:tcPr>
           <w:p>
             <w:r>
-              <w:t>Solid DB schema design and pure calculator pattern; no pagination on critical list endpoints is a scalability risk.</w:t>
+              <w:t>Transaction model redesigned (recipients lookup, bucket_key removed, FK on recipient_id dropped). Redundant DB columns removed. Calculator job_scales bug fixed. No pagination on critical list endpoints remains.</w:t>
             </w:r>
           </w:p>
         </w:tc>
@@ -2581,7 +2581,7 @@
           <w:sz w:val="26"/>
           <w:szCs w:val="26"/>
         </w:rPr>
-        <w:t xml:space="preserve">    5/10</w:t>
+        <w:t xml:space="preserve">    6/10</w:t>
       </w:r>
     </w:p>
     <w:p>
@@ -3371,7 +3371,7 @@
                 <w:bCs/>
                 <w:color w:val="DC2626"/>
               </w:rPr>
-              <w:t xml:space="preserve">BUG-1 — CRITICAL  </w:t>
+              <w:t>FIXED (2026-03-29) — BUG-1 — Rate card key mismatch: job_scales dict was keyed by bucket_key instead of job_key in sites.py _build_financials. Fixed. Redundant job_key column also removed from schema_acc.rate_card; bucket_key removed from schema_core.jobs.</w:t>
             </w:r>
             <w:r>
               <w:t xml:space="preserve">Rate card key mismatch: seeded </w:t>
@@ -3499,7 +3499,7 @@
                 <w:sz w:val="32"/>
                 <w:szCs w:val="32"/>
               </w:rPr>
-              <w:t>5/10</w:t>
+              <w:t>6/10</w:t>
             </w:r>
           </w:p>
         </w:tc>
@@ -3522,7 +3522,7 @@
           </w:tcPr>
           <w:p>
             <w:r>
-              <w:t>Core infra config is clean; business-rule constants scattered across per-project config files with a critical data/code divergence in JOB_BUCKETS and the rate card key mismatch.</w:t>
+              <w:t>Core infra config is clean. BUG-1 (job_scales key fix) resolved. Redundant bucket_key/job_key columns removed from DB. JOB_BUCKETS code/DB divergence (DEBT-5) remains.</w:t>
             </w:r>
           </w:p>
         </w:tc>
@@ -5818,7 +5818,7 @@
           <w:sz w:val="26"/>
           <w:szCs w:val="26"/>
         </w:rPr>
-        <w:t xml:space="preserve">    3/10</w:t>
+        <w:t xml:space="preserve">    5/10</w:t>
       </w:r>
     </w:p>
     <w:p>
@@ -5911,7 +5911,7 @@
                 <w:sz w:val="19"/>
                 <w:szCs w:val="19"/>
               </w:rPr>
-              <w:t>BUG-1</w:t>
+              <w:t>BUG-1 ✓ FIXED</w:t>
             </w:r>
           </w:p>
         </w:tc>
@@ -5943,7 +5943,7 @@
                 <w:sz w:val="19"/>
                 <w:szCs w:val="19"/>
               </w:rPr>
-              <w:t>Rate card key mismatch — calculator produces zero cost for all pre-seeded MI rates</w:t>
+              <w:t>Rate card key mismatch — FIXED 2026-03-29. job_scales in sites.py now keyed by job_key (was bucket_key). Redundant job_key column dropped from rate_card; bucket_key dropped from jobs.</w:t>
             </w:r>
           </w:p>
         </w:tc>
@@ -6091,7 +6091,7 @@
                 <w:sz w:val="18"/>
                 <w:szCs w:val="18"/>
               </w:rPr>
-              <w:t xml:space="preserve">UPDATE </w:t>
+              <w:t>Fixed in sites.py _build_financials: job_scales = {job.job_key: job.scale_by ...} and rates now join to Job for job_key. DB columns dropped via migration 0037.</w:t>
             </w:r>
             <w:proofErr w:type="spellStart"/>
             <w:r>
@@ -6765,7 +6765,7 @@
                 <w:sz w:val="32"/>
                 <w:szCs w:val="32"/>
               </w:rPr>
-              <w:t>3/10</w:t>
+              <w:t>5/10</w:t>
             </w:r>
           </w:p>
         </w:tc>
@@ -6788,7 +6788,7 @@
           </w:tcPr>
           <w:p>
             <w:r>
-              <w:t>BUG-1 (rate card) and BUG-2 (error handlers) are unresolved production issues; DEBT-3 (BB providers) blocks a whole project type; remaining items are architectural improvements.</w:t>
+              <w:t>BUG-1 resolved (job_scales fix). DEBT-3 resolved (providers table dropped). Invoice badge transitions added. BB schema cleaned. BUG-2 (error handlers) and remaining DEBT items still open.</w:t>
             </w:r>
           </w:p>
         </w:tc>
@@ -9236,7 +9236,7 @@
                 <w:bCs/>
                 <w:color w:val="16A34A"/>
               </w:rPr>
-              <w:t>7/10</w:t>
+              <w:t>8/10</w:t>
             </w:r>
           </w:p>
         </w:tc>
@@ -9370,7 +9370,7 @@
                 <w:bCs/>
                 <w:color w:val="D97706"/>
               </w:rPr>
-              <w:t>5/10</w:t>
+              <w:t>6/10</w:t>
             </w:r>
           </w:p>
         </w:tc>
@@ -10040,7 +10040,7 @@
                 <w:bCs/>
                 <w:color w:val="DC2626"/>
               </w:rPr>
-              <w:t>3/10</w:t>
+              <w:t>5/10</w:t>
             </w:r>
           </w:p>
         </w:tc>
@@ -10438,7 +10438,7 @@
                 <w:sz w:val="28"/>
                 <w:szCs w:val="28"/>
               </w:rPr>
-              <w:t>54 / 100</w:t>
+              <w:t>58 / 100</w:t>
             </w:r>
           </w:p>
         </w:tc>

</xml_diff>